<commit_message>
Align grading guides with spreadsheet ZIP export and repeat checklist
</commit_message>
<xml_diff>
--- a/IUEA_Teaching_Plan/test_operations/Test_Grading_Checklist.docx
+++ b/IUEA_Teaching_Plan/test_operations/Test_Grading_Checklist.docx
@@ -20,6 +20,24 @@
     <w:p>
       <w:r>
         <w:t>Use wirmbeesubs@gmail.com for the lecturer forms and Drive. Google AI Plus is not needed. Keep this account: it still owns the teaching files.</w:t>
+      </w:r>
+    </w:p>
+    <w:p>
+      <w:r>
+        <w:t>For weekly A1–A5 and Quiz 1–5 grading, use the Continue grading guide linked below. The spreadsheet Export Grading ZIP menu does not export practical tests.</w:t>
+      </w:r>
+    </w:p>
+    <w:p>
+      <w:pPr>
+        <w:pStyle w:val="Heading1"/>
+      </w:pPr>
+      <w:r>
+        <w:t>Prepare students</w:t>
+      </w:r>
+    </w:p>
+    <w:p>
+      <w:r>
+        <w:t>A few days before: send the Week 7 or Week 14 revision PDF and its matching practice CSV. Students practise in a blank Colab notebook; no practice upload is required. The portal releases test files only during the enabled test window.</w:t>
       </w:r>
     </w:p>
     <w:p>
@@ -59,6 +77,11 @@
       </w:r>
     </w:p>
     <w:p>
+      <w:r>
+        <w:br w:type="page"/>
+      </w:r>
+    </w:p>
+    <w:p>
       <w:pPr>
         <w:pStyle w:val="Heading1"/>
       </w:pPr>
@@ -92,7 +115,32 @@
       </w:r>
     </w:p>
     <w:p>
+      <w:r>
+        <w:t>9. Save and push the private snapshot before switching Macs, using step 6 of Continue grading. New test marks need production test-ledger integration into the cumulative workbook; the weekly grading command does not import them automatically.</w:t>
+      </w:r>
+    </w:p>
+    <w:p>
       <w:hyperlink r:id="rId9">
+        <w:r>
+          <w:rPr>
+            <w:color w:val="0563C1"/>
+          </w:rPr>
+          <w:t>Weekly grading and private backup checklist</w:t>
+        </w:r>
+      </w:hyperlink>
+    </w:p>
+    <w:p>
+      <w:hyperlink r:id="rId10">
+        <w:r>
+          <w:rPr>
+            <w:color w:val="0563C1"/>
+          </w:rPr>
+          <w:t>Full test checklist and cumulative marks guidance</w:t>
+        </w:r>
+      </w:hyperlink>
+    </w:p>
+    <w:p>
+      <w:hyperlink r:id="rId11">
         <w:r>
           <w:rPr>
             <w:color w:val="0563C1"/>
@@ -102,7 +150,7 @@
       </w:hyperlink>
     </w:p>
     <w:p>
-      <w:hyperlink r:id="rId10">
+      <w:hyperlink r:id="rId12">
         <w:r>
           <w:rPr>
             <w:color w:val="0563C1"/>

</xml_diff>

<commit_message>
Add practical test ZIP export menu and update grading guides
</commit_message>
<xml_diff>
--- a/IUEA_Teaching_Plan/test_operations/Test_Grading_Checklist.docx
+++ b/IUEA_Teaching_Plan/test_operations/Test_Grading_Checklist.docx
@@ -24,7 +24,7 @@
     </w:p>
     <w:p>
       <w:r>
-        <w:t>For weekly A1–A5 and Quiz 1–5 grading, use the Continue grading guide linked below. The spreadsheet Export Grading ZIP menu does not export practical tests.</w:t>
+        <w:t>For weekly A1–A5 and Quiz 1–5 grading, use the Continue grading guide linked below. Weekly work uses Export Grading ZIP in the assignment workbook. Tests use Export Test ZIP in the test workbook.</w:t>
       </w:r>
     </w:p>
     <w:p>
@@ -96,7 +96,7 @@
     </w:p>
     <w:p>
       <w:r>
-        <w:t>5. In Apps Script, choose exportCollectedColabTests and click Run. Open the DOWNLOAD BATCH link in Execution log and download its ZIP.</w:t>
+        <w:t>5. In the test collection workbook, choose Export Test ZIP &gt; Export latest submissions. Refresh once if the menu is missing; authorize it on first use. Use View progress / download and wait for the new export to say COMPLETE. While the request says PENDING, the old link may remain visible. Download the ZIP from Download / detail. It includes both tests across all three programmes; rehearsal entries are excluded.</w:t>
       </w:r>
     </w:p>
     <w:p>
@@ -112,6 +112,11 @@
     <w:p>
       <w:r>
         <w:t>8. Keep the ZIP and results private. Results are in IUEA_Teaching_Plan/test_operations/grading_output (inside this repository). Re-running the same batch does not duplicate marks. Test 1 contributes 15 semester points; Test 2 contributes 20.</w:t>
+      </w:r>
+    </w:p>
+    <w:p>
+      <w:r>
+        <w:t>If export stops: read Download / detail, fix the problem and choose Export latest submissions again. Existing submissions remain intact. Repeated clicks while queued or running do not start another export.</w:t>
       </w:r>
     </w:p>
     <w:p>

</xml_diff>

<commit_message>
Automatically publish practical test marks into cumulative assessment workbook
</commit_message>
<xml_diff>
--- a/IUEA_Teaching_Plan/test_operations/Test_Grading_Checklist.docx
+++ b/IUEA_Teaching_Plan/test_operations/Test_Grading_Checklist.docx
@@ -101,12 +101,12 @@
     </w:p>
     <w:p>
       <w:r>
-        <w:t>6. Start Docker Desktop. Double-click Grade_Tests.command in the test_operations folder. Drag the ZIP into the Terminal window and press Return. Keep the Mac on until grading finishes.</w:t>
+        <w:t>6. Finish weekly grading and close both marks workbooks in Excel. Start Docker Desktop. Double-click Grade_Tests.command in the test_operations folder. Drag the ZIP into the Terminal window and press Return. Keep the Mac on until grading finishes.</w:t>
       </w:r>
     </w:p>
     <w:p>
       <w:r>
-        <w:t>7. Test_Marks.xlsx opens automatically. Check Current marks, All attempts and Collection issues. Match the submission count to the collection workbook. Resolve pending or conflicting rows before releasing marks; a blank is not zero.</w:t>
+        <w:t>7. Test_Marks.xlsx and IUEA_Continuous_Assessment.xlsx open automatically. Test marks are added to the cumulative workbook without a manual import. Check Current marks, All attempts and Collection issues. Match the submission count to the collection workbook. Resolve pending or conflicting rows before releasing marks; a blank is not zero.</w:t>
       </w:r>
     </w:p>
     <w:p>
@@ -121,7 +121,7 @@
     </w:p>
     <w:p>
       <w:r>
-        <w:t>9. Save and push the private snapshot before switching Macs, using step 6 of Continue grading. New test marks need production test-ledger integration into the cumulative workbook; the weekly grading command does not import them automatically.</w:t>
+        <w:t>9. Save and push the private snapshot before switching Macs, using step 6 of Continue grading. If the cumulative update fails, fix the reported issue and rerun the same test command with the same ZIP. Saved test attempts are reused.</w:t>
       </w:r>
     </w:p>
     <w:p>

</xml_diff>